<commit_message>
Finalizado os estudos do dia 2
</commit_message>
<xml_diff>
--- a/2_Docker/Docker.docx
+++ b/2_Docker/Docker.docx
@@ -58,29 +58,7 @@
           <w:sz w:val="16"/>
           <w:szCs w:val="16"/>
         </w:rPr>
-        <w:t xml:space="preserve">Dia 1 – </w:t>
-      </w:r>
-      <w:r>
-        <w:rPr>
-          <w:rFonts w:eastAsia="Liberation Mono" w:cs="Liberation Mono" w:ascii="Liberation Mono" w:hAnsi="Liberation Mono"/>
-          <w:b/>
-          <w:bCs/>
-          <w:color w:val="FF0000"/>
-          <w:sz w:val="16"/>
-          <w:szCs w:val="16"/>
-        </w:rPr>
-        <w:t>16</w:t>
-      </w:r>
-      <w:r>
-        <w:rPr>
-          <w:rFonts w:eastAsia="Liberation Mono" w:cs="Liberation Mono" w:ascii="Liberation Mono" w:hAnsi="Liberation Mono"/>
-          <w:b/>
-          <w:bCs/>
-          <w:color w:val="FF0000"/>
-          <w:sz w:val="16"/>
-          <w:szCs w:val="16"/>
-        </w:rPr>
-        <w:t>/08/2026</w:t>
+        <w:t>Dia 1 – 17/08/2026</w:t>
       </w:r>
     </w:p>
     <w:p>
@@ -6096,49 +6074,7 @@
           <w:shd w:fill="auto" w:val="clear"/>
           <w:vertAlign w:val="baseline"/>
         </w:rPr>
-        <w:t>Dia 2 – 1</w:t>
-      </w:r>
-      <w:r>
-        <w:rPr>
-          <w:rFonts w:eastAsia="Liberation Mono" w:cs="Liberation Mono" w:ascii="Liberation Mono" w:hAnsi="Liberation Mono"/>
-          <w:b/>
-          <w:bCs/>
-          <w:i w:val="false"/>
-          <w:iCs w:val="false"/>
-          <w:caps w:val="false"/>
-          <w:smallCaps w:val="false"/>
-          <w:strike w:val="false"/>
-          <w:dstrike w:val="false"/>
-          <w:color w:val="FF0000"/>
-          <w:position w:val="0"/>
-          <w:sz w:val="16"/>
-          <w:szCs w:val="16"/>
-          <w:u w:val="none"/>
-          <w:shd w:fill="auto" w:val="clear"/>
-          <w:vertAlign w:val="baseline"/>
-        </w:rPr>
-        <w:t>7</w:t>
-      </w:r>
-      <w:r>
-        <w:rPr>
-          <w:rFonts w:eastAsia="Liberation Mono" w:cs="Liberation Mono" w:ascii="Liberation Mono" w:hAnsi="Liberation Mono"/>
-          <w:b/>
-          <w:bCs/>
-          <w:i w:val="false"/>
-          <w:iCs w:val="false"/>
-          <w:caps w:val="false"/>
-          <w:smallCaps w:val="false"/>
-          <w:strike w:val="false"/>
-          <w:dstrike w:val="false"/>
-          <w:color w:val="FF0000"/>
-          <w:position w:val="0"/>
-          <w:sz w:val="16"/>
-          <w:szCs w:val="16"/>
-          <w:u w:val="none"/>
-          <w:shd w:fill="auto" w:val="clear"/>
-          <w:vertAlign w:val="baseline"/>
-        </w:rPr>
-        <w:t>/08/2026</w:t>
+        <w:t>Dia 2 – 18/08/2026</w:t>
       </w:r>
     </w:p>
     <w:p>
@@ -13392,8 +13328,8 @@
         </w:tblCellMar>
       </w:tblPr>
       <w:tblGrid>
-        <w:gridCol w:w="2702"/>
-        <w:gridCol w:w="7421"/>
+        <w:gridCol w:w="2700"/>
+        <w:gridCol w:w="7423"/>
       </w:tblGrid>
       <w:tr>
         <w:trPr>
@@ -13401,7 +13337,7 @@
         </w:trPr>
         <w:tc>
           <w:tcPr>
-            <w:tcW w:w="2702" w:type="dxa"/>
+            <w:tcW w:w="2700" w:type="dxa"/>
             <w:tcBorders>
               <w:top w:val="single" w:sz="2" w:space="0" w:color="000000"/>
               <w:start w:val="single" w:sz="2" w:space="0" w:color="000000"/>
@@ -13438,7 +13374,7 @@
         </w:tc>
         <w:tc>
           <w:tcPr>
-            <w:tcW w:w="7421" w:type="dxa"/>
+            <w:tcW w:w="7423" w:type="dxa"/>
             <w:tcBorders>
               <w:top w:val="single" w:sz="2" w:space="0" w:color="000000"/>
               <w:start w:val="single" w:sz="2" w:space="0" w:color="000000"/>
@@ -13478,7 +13414,7 @@
         <w:trPr/>
         <w:tc>
           <w:tcPr>
-            <w:tcW w:w="2702" w:type="dxa"/>
+            <w:tcW w:w="2700" w:type="dxa"/>
             <w:tcBorders>
               <w:top w:val="single" w:sz="2" w:space="0" w:color="000000"/>
               <w:start w:val="single" w:sz="2" w:space="0" w:color="000000"/>
@@ -13516,7 +13452,7 @@
         </w:tc>
         <w:tc>
           <w:tcPr>
-            <w:tcW w:w="7421" w:type="dxa"/>
+            <w:tcW w:w="7423" w:type="dxa"/>
             <w:tcBorders>
               <w:top w:val="single" w:sz="2" w:space="0" w:color="000000"/>
               <w:start w:val="single" w:sz="2" w:space="0" w:color="000000"/>
@@ -13552,7 +13488,7 @@
         <w:trPr/>
         <w:tc>
           <w:tcPr>
-            <w:tcW w:w="2702" w:type="dxa"/>
+            <w:tcW w:w="2700" w:type="dxa"/>
             <w:tcBorders>
               <w:top w:val="single" w:sz="2" w:space="0" w:color="000000"/>
               <w:start w:val="single" w:sz="2" w:space="0" w:color="000000"/>
@@ -13590,7 +13526,7 @@
         </w:tc>
         <w:tc>
           <w:tcPr>
-            <w:tcW w:w="7421" w:type="dxa"/>
+            <w:tcW w:w="7423" w:type="dxa"/>
             <w:tcBorders>
               <w:top w:val="single" w:sz="2" w:space="0" w:color="000000"/>
               <w:start w:val="single" w:sz="2" w:space="0" w:color="000000"/>
@@ -13626,7 +13562,7 @@
         <w:trPr/>
         <w:tc>
           <w:tcPr>
-            <w:tcW w:w="2702" w:type="dxa"/>
+            <w:tcW w:w="2700" w:type="dxa"/>
             <w:tcBorders>
               <w:top w:val="single" w:sz="2" w:space="0" w:color="000000"/>
               <w:start w:val="single" w:sz="2" w:space="0" w:color="000000"/>
@@ -13664,7 +13600,7 @@
         </w:tc>
         <w:tc>
           <w:tcPr>
-            <w:tcW w:w="7421" w:type="dxa"/>
+            <w:tcW w:w="7423" w:type="dxa"/>
             <w:tcBorders>
               <w:top w:val="single" w:sz="2" w:space="0" w:color="000000"/>
               <w:start w:val="single" w:sz="2" w:space="0" w:color="000000"/>
@@ -13700,7 +13636,7 @@
         <w:trPr/>
         <w:tc>
           <w:tcPr>
-            <w:tcW w:w="2702" w:type="dxa"/>
+            <w:tcW w:w="2700" w:type="dxa"/>
             <w:tcBorders>
               <w:top w:val="single" w:sz="2" w:space="0" w:color="000000"/>
               <w:start w:val="single" w:sz="2" w:space="0" w:color="000000"/>
@@ -13738,7 +13674,7 @@
         </w:tc>
         <w:tc>
           <w:tcPr>
-            <w:tcW w:w="7421" w:type="dxa"/>
+            <w:tcW w:w="7423" w:type="dxa"/>
             <w:tcBorders>
               <w:top w:val="single" w:sz="2" w:space="0" w:color="000000"/>
               <w:start w:val="single" w:sz="2" w:space="0" w:color="000000"/>
@@ -13774,7 +13710,7 @@
         <w:trPr/>
         <w:tc>
           <w:tcPr>
-            <w:tcW w:w="2702" w:type="dxa"/>
+            <w:tcW w:w="2700" w:type="dxa"/>
             <w:tcBorders>
               <w:top w:val="single" w:sz="2" w:space="0" w:color="000000"/>
               <w:start w:val="single" w:sz="2" w:space="0" w:color="000000"/>
@@ -13812,7 +13748,7 @@
         </w:tc>
         <w:tc>
           <w:tcPr>
-            <w:tcW w:w="7421" w:type="dxa"/>
+            <w:tcW w:w="7423" w:type="dxa"/>
             <w:tcBorders>
               <w:top w:val="single" w:sz="2" w:space="0" w:color="000000"/>
               <w:start w:val="single" w:sz="2" w:space="0" w:color="000000"/>
@@ -13848,7 +13784,7 @@
         <w:trPr/>
         <w:tc>
           <w:tcPr>
-            <w:tcW w:w="2702" w:type="dxa"/>
+            <w:tcW w:w="2700" w:type="dxa"/>
             <w:tcBorders>
               <w:top w:val="single" w:sz="2" w:space="0" w:color="000000"/>
               <w:start w:val="single" w:sz="2" w:space="0" w:color="000000"/>
@@ -13886,7 +13822,7 @@
         </w:tc>
         <w:tc>
           <w:tcPr>
-            <w:tcW w:w="7421" w:type="dxa"/>
+            <w:tcW w:w="7423" w:type="dxa"/>
             <w:tcBorders>
               <w:top w:val="single" w:sz="2" w:space="0" w:color="000000"/>
               <w:start w:val="single" w:sz="2" w:space="0" w:color="000000"/>
@@ -13922,7 +13858,7 @@
         <w:trPr/>
         <w:tc>
           <w:tcPr>
-            <w:tcW w:w="2702" w:type="dxa"/>
+            <w:tcW w:w="2700" w:type="dxa"/>
             <w:tcBorders>
               <w:top w:val="single" w:sz="2" w:space="0" w:color="000000"/>
               <w:start w:val="single" w:sz="2" w:space="0" w:color="000000"/>
@@ -13960,7 +13896,7 @@
         </w:tc>
         <w:tc>
           <w:tcPr>
-            <w:tcW w:w="7421" w:type="dxa"/>
+            <w:tcW w:w="7423" w:type="dxa"/>
             <w:tcBorders>
               <w:top w:val="single" w:sz="2" w:space="0" w:color="000000"/>
               <w:start w:val="single" w:sz="2" w:space="0" w:color="000000"/>
@@ -13996,7 +13932,7 @@
         <w:trPr/>
         <w:tc>
           <w:tcPr>
-            <w:tcW w:w="2702" w:type="dxa"/>
+            <w:tcW w:w="2700" w:type="dxa"/>
             <w:tcBorders>
               <w:top w:val="single" w:sz="2" w:space="0" w:color="000000"/>
               <w:start w:val="single" w:sz="2" w:space="0" w:color="000000"/>
@@ -14034,7 +13970,7 @@
         </w:tc>
         <w:tc>
           <w:tcPr>
-            <w:tcW w:w="7421" w:type="dxa"/>
+            <w:tcW w:w="7423" w:type="dxa"/>
             <w:tcBorders>
               <w:top w:val="single" w:sz="2" w:space="0" w:color="000000"/>
               <w:start w:val="single" w:sz="2" w:space="0" w:color="000000"/>
@@ -14070,7 +14006,7 @@
         <w:trPr/>
         <w:tc>
           <w:tcPr>
-            <w:tcW w:w="2702" w:type="dxa"/>
+            <w:tcW w:w="2700" w:type="dxa"/>
             <w:tcBorders>
               <w:top w:val="single" w:sz="2" w:space="0" w:color="000000"/>
               <w:start w:val="single" w:sz="2" w:space="0" w:color="000000"/>
@@ -14108,7 +14044,7 @@
         </w:tc>
         <w:tc>
           <w:tcPr>
-            <w:tcW w:w="7421" w:type="dxa"/>
+            <w:tcW w:w="7423" w:type="dxa"/>
             <w:tcBorders>
               <w:top w:val="single" w:sz="2" w:space="0" w:color="000000"/>
               <w:start w:val="single" w:sz="2" w:space="0" w:color="000000"/>
@@ -14144,7 +14080,7 @@
         <w:trPr/>
         <w:tc>
           <w:tcPr>
-            <w:tcW w:w="2702" w:type="dxa"/>
+            <w:tcW w:w="2700" w:type="dxa"/>
             <w:tcBorders>
               <w:top w:val="single" w:sz="2" w:space="0" w:color="000000"/>
               <w:start w:val="single" w:sz="2" w:space="0" w:color="000000"/>
@@ -14182,7 +14118,7 @@
         </w:tc>
         <w:tc>
           <w:tcPr>
-            <w:tcW w:w="7421" w:type="dxa"/>
+            <w:tcW w:w="7423" w:type="dxa"/>
             <w:tcBorders>
               <w:top w:val="single" w:sz="2" w:space="0" w:color="000000"/>
               <w:start w:val="single" w:sz="2" w:space="0" w:color="000000"/>
@@ -14218,7 +14154,7 @@
         <w:trPr/>
         <w:tc>
           <w:tcPr>
-            <w:tcW w:w="2702" w:type="dxa"/>
+            <w:tcW w:w="2700" w:type="dxa"/>
             <w:tcBorders>
               <w:top w:val="single" w:sz="2" w:space="0" w:color="000000"/>
               <w:start w:val="single" w:sz="2" w:space="0" w:color="000000"/>
@@ -14256,7 +14192,7 @@
         </w:tc>
         <w:tc>
           <w:tcPr>
-            <w:tcW w:w="7421" w:type="dxa"/>
+            <w:tcW w:w="7423" w:type="dxa"/>
             <w:tcBorders>
               <w:top w:val="single" w:sz="2" w:space="0" w:color="000000"/>
               <w:start w:val="single" w:sz="2" w:space="0" w:color="000000"/>
@@ -21847,7 +21783,7 @@
           <w:shd w:fill="auto" w:val="clear"/>
           <w:vertAlign w:val="baseline"/>
         </w:rPr>
-        <w:t>8</w:t>
+        <w:t>9</w:t>
       </w:r>
       <w:r>
         <w:rPr>
@@ -25280,49 +25216,7 @@
           <w:shd w:fill="auto" w:val="clear"/>
           <w:vertAlign w:val="baseline"/>
         </w:rPr>
-        <w:t>Dia 4 – 1</w:t>
-      </w:r>
-      <w:r>
-        <w:rPr>
-          <w:rFonts w:ascii="Liberation Mono" w:hAnsi="Liberation Mono"/>
-          <w:b/>
-          <w:bCs/>
-          <w:i w:val="false"/>
-          <w:iCs w:val="false"/>
-          <w:caps w:val="false"/>
-          <w:smallCaps w:val="false"/>
-          <w:strike w:val="false"/>
-          <w:dstrike w:val="false"/>
-          <w:color w:val="FF0000"/>
-          <w:position w:val="0"/>
-          <w:sz w:val="16"/>
-          <w:szCs w:val="16"/>
-          <w:u w:val="none"/>
-          <w:shd w:fill="auto" w:val="clear"/>
-          <w:vertAlign w:val="baseline"/>
-        </w:rPr>
-        <w:t>9</w:t>
-      </w:r>
-      <w:r>
-        <w:rPr>
-          <w:rFonts w:ascii="Liberation Mono" w:hAnsi="Liberation Mono"/>
-          <w:b/>
-          <w:bCs/>
-          <w:i w:val="false"/>
-          <w:iCs w:val="false"/>
-          <w:caps w:val="false"/>
-          <w:smallCaps w:val="false"/>
-          <w:strike w:val="false"/>
-          <w:dstrike w:val="false"/>
-          <w:color w:val="FF0000"/>
-          <w:position w:val="0"/>
-          <w:sz w:val="16"/>
-          <w:szCs w:val="16"/>
-          <w:u w:val="none"/>
-          <w:shd w:fill="auto" w:val="clear"/>
-          <w:vertAlign w:val="baseline"/>
-        </w:rPr>
-        <w:t>/08/2026</w:t>
+        <w:t>Dia 4 – 19/08/2026</w:t>
       </w:r>
     </w:p>
     <w:p>

</xml_diff>